<commit_message>
some labs for db, sp, kms and others
</commit_message>
<xml_diff>
--- a/ос/лабы/2/лб2 скрины.docx
+++ b/ос/лабы/2/лб2 скрины.docx
@@ -652,9 +652,6 @@
       </w:r>
       <w:proofErr w:type="spellEnd"/>
       <w:r>
-        <w:rPr>
-          <w:lang w:val="en-US"/>
-        </w:rPr>
         <w:t xml:space="preserve"> 1</w:t>
       </w:r>
     </w:p>
@@ -790,7 +787,7 @@
       </w:pPr>
       <w:r>
         <w:pict w14:anchorId="5FD4DC0B">
-          <v:rect id="_x0000_i1037" style="width:0;height:1.5pt" o:hralign="center" o:hrstd="t" o:hr="t" fillcolor="#a0a0a0" stroked="f"/>
+          <v:rect id="_x0000_i1025" style="width:0;height:1.5pt" o:hralign="center" o:hrstd="t" o:hr="t" fillcolor="#a0a0a0" stroked="f"/>
         </w:pict>
       </w:r>
     </w:p>
@@ -900,7 +897,7 @@
       </w:pPr>
       <w:r>
         <w:pict w14:anchorId="040A84DD">
-          <v:rect id="_x0000_i1038" style="width:0;height:1.5pt" o:hralign="center" o:hrstd="t" o:hr="t" fillcolor="#a0a0a0" stroked="f"/>
+          <v:rect id="_x0000_i1026" style="width:0;height:1.5pt" o:hralign="center" o:hrstd="t" o:hr="t" fillcolor="#a0a0a0" stroked="f"/>
         </w:pict>
       </w:r>
     </w:p>
@@ -1009,6 +1006,9 @@
         <w:jc w:val="both"/>
       </w:pPr>
       <w:r>
+        <w:rPr>
+          <w:noProof/>
+        </w:rPr>
         <w:drawing>
           <wp:inline distT="0" distB="0" distL="0" distR="0" wp14:anchorId="3E35E376" wp14:editId="0E30FD2D">
             <wp:extent cx="5939790" cy="3011170"/>
@@ -1281,7 +1281,7 @@
       </w:pPr>
       <w:r>
         <w:pict w14:anchorId="1BE4784B">
-          <v:rect id="_x0000_i1053" style="width:0;height:1.5pt" o:hralign="center" o:hrstd="t" o:hr="t" fillcolor="#a0a0a0" stroked="f"/>
+          <v:rect id="_x0000_i1027" style="width:0;height:1.5pt" o:hralign="center" o:hrstd="t" o:hr="t" fillcolor="#a0a0a0" stroked="f"/>
         </w:pict>
       </w:r>
     </w:p>
@@ -1446,7 +1446,7 @@
       </w:pPr>
       <w:r>
         <w:pict w14:anchorId="26E797A2">
-          <v:rect id="_x0000_i1054" style="width:0;height:1.5pt" o:hralign="center" o:hrstd="t" o:hr="t" fillcolor="#a0a0a0" stroked="f"/>
+          <v:rect id="_x0000_i1028" style="width:0;height:1.5pt" o:hralign="center" o:hrstd="t" o:hr="t" fillcolor="#a0a0a0" stroked="f"/>
         </w:pict>
       </w:r>
     </w:p>
@@ -1662,6 +1662,7 @@
       </w:pPr>
       <w:r>
         <w:rPr>
+          <w:noProof/>
           <w:lang w:val="en-US"/>
         </w:rPr>
         <w:lastRenderedPageBreak/>
@@ -1755,6 +1756,7 @@
       </w:pPr>
       <w:r>
         <w:rPr>
+          <w:noProof/>
           <w:lang w:val="en-US"/>
         </w:rPr>
         <w:drawing>
@@ -1841,6 +1843,7 @@
       </w:pPr>
       <w:r>
         <w:rPr>
+          <w:noProof/>
           <w:lang w:val="en-US"/>
         </w:rPr>
         <w:drawing>
@@ -1927,6 +1930,7 @@
       </w:pPr>
       <w:r>
         <w:rPr>
+          <w:noProof/>
           <w:lang w:val="en-US"/>
         </w:rPr>
         <w:drawing>
@@ -2013,6 +2017,7 @@
       </w:pPr>
       <w:r>
         <w:rPr>
+          <w:noProof/>
           <w:lang w:val="en-US"/>
         </w:rPr>
         <w:lastRenderedPageBreak/>
@@ -2100,6 +2105,7 @@
       </w:pPr>
       <w:r>
         <w:rPr>
+          <w:noProof/>
           <w:lang w:val="en-US"/>
         </w:rPr>
         <w:drawing>
@@ -2196,6 +2202,7 @@
       </w:pPr>
       <w:r>
         <w:rPr>
+          <w:noProof/>
           <w:lang w:val="en-US"/>
         </w:rPr>
         <w:drawing>
@@ -2282,6 +2289,7 @@
       </w:pPr>
       <w:r>
         <w:rPr>
+          <w:noProof/>
           <w:lang w:val="en-US"/>
         </w:rPr>
         <w:lastRenderedPageBreak/>
@@ -2359,6 +2367,7 @@
       </w:pPr>
       <w:r>
         <w:rPr>
+          <w:noProof/>
           <w:lang w:val="en-US"/>
         </w:rPr>
         <w:lastRenderedPageBreak/>
@@ -2436,6 +2445,7 @@
       </w:pPr>
       <w:r>
         <w:rPr>
+          <w:noProof/>
           <w:lang w:val="en-US"/>
         </w:rPr>
         <w:drawing>
@@ -2522,6 +2532,7 @@
       </w:pPr>
       <w:r>
         <w:rPr>
+          <w:noProof/>
           <w:lang w:val="en-US"/>
         </w:rPr>
         <w:drawing>
@@ -2576,19 +2587,182 @@
         <w:spacing w:after="0"/>
         <w:ind w:firstLine="709"/>
         <w:jc w:val="both"/>
-        <w:rPr>
-          <w:lang w:val="en-US"/>
-        </w:rPr>
-      </w:pPr>
-    </w:p>
-    <w:p>
-      <w:pPr>
-        <w:spacing w:after="0"/>
-        <w:ind w:firstLine="709"/>
-        <w:jc w:val="both"/>
-        <w:rPr>
-          <w:lang w:val="en-US"/>
-        </w:rPr>
+      </w:pPr>
+      <w:r>
+        <w:rPr>
+          <w:lang w:val="en-US"/>
+        </w:rPr>
+        <w:lastRenderedPageBreak/>
+        <w:drawing>
+          <wp:inline distT="0" distB="0" distL="0" distR="0" wp14:anchorId="0340A6D0" wp14:editId="624C3128">
+            <wp:extent cx="5077534" cy="2667372"/>
+            <wp:effectExtent l="0" t="0" r="8890" b="0"/>
+            <wp:docPr id="183448395" name="Рисунок 1"/>
+            <wp:cNvGraphicFramePr>
+              <a:graphicFrameLocks xmlns:a="http://schemas.openxmlformats.org/drawingml/2006/main" noChangeAspect="1"/>
+            </wp:cNvGraphicFramePr>
+            <a:graphic xmlns:a="http://schemas.openxmlformats.org/drawingml/2006/main">
+              <a:graphicData uri="http://schemas.openxmlformats.org/drawingml/2006/picture">
+                <pic:pic xmlns:pic="http://schemas.openxmlformats.org/drawingml/2006/picture">
+                  <pic:nvPicPr>
+                    <pic:cNvPr id="183448395" name=""/>
+                    <pic:cNvPicPr/>
+                  </pic:nvPicPr>
+                  <pic:blipFill>
+                    <a:blip r:embed="rId26"/>
+                    <a:stretch>
+                      <a:fillRect/>
+                    </a:stretch>
+                  </pic:blipFill>
+                  <pic:spPr>
+                    <a:xfrm>
+                      <a:off x="0" y="0"/>
+                      <a:ext cx="5077534" cy="2667372"/>
+                    </a:xfrm>
+                    <a:prstGeom prst="rect">
+                      <a:avLst/>
+                    </a:prstGeom>
+                  </pic:spPr>
+                </pic:pic>
+              </a:graphicData>
+            </a:graphic>
+          </wp:inline>
+        </w:drawing>
+      </w:r>
+      <w:r>
+        <w:drawing>
+          <wp:inline distT="0" distB="0" distL="0" distR="0" wp14:anchorId="3FD3AA89" wp14:editId="3EFFB2A6">
+            <wp:extent cx="5939790" cy="730250"/>
+            <wp:effectExtent l="0" t="0" r="3810" b="0"/>
+            <wp:docPr id="1285002969" name="Рисунок 1"/>
+            <wp:cNvGraphicFramePr>
+              <a:graphicFrameLocks xmlns:a="http://schemas.openxmlformats.org/drawingml/2006/main" noChangeAspect="1"/>
+            </wp:cNvGraphicFramePr>
+            <a:graphic xmlns:a="http://schemas.openxmlformats.org/drawingml/2006/main">
+              <a:graphicData uri="http://schemas.openxmlformats.org/drawingml/2006/picture">
+                <pic:pic xmlns:pic="http://schemas.openxmlformats.org/drawingml/2006/picture">
+                  <pic:nvPicPr>
+                    <pic:cNvPr id="1285002969" name=""/>
+                    <pic:cNvPicPr/>
+                  </pic:nvPicPr>
+                  <pic:blipFill>
+                    <a:blip r:embed="rId27"/>
+                    <a:stretch>
+                      <a:fillRect/>
+                    </a:stretch>
+                  </pic:blipFill>
+                  <pic:spPr>
+                    <a:xfrm>
+                      <a:off x="0" y="0"/>
+                      <a:ext cx="5939790" cy="730250"/>
+                    </a:xfrm>
+                    <a:prstGeom prst="rect">
+                      <a:avLst/>
+                    </a:prstGeom>
+                  </pic:spPr>
+                </pic:pic>
+              </a:graphicData>
+            </a:graphic>
+          </wp:inline>
+        </w:drawing>
+      </w:r>
+    </w:p>
+    <w:p>
+      <w:pPr>
+        <w:spacing w:after="0"/>
+        <w:ind w:firstLine="709"/>
+        <w:jc w:val="both"/>
+      </w:pPr>
+    </w:p>
+    <w:p>
+      <w:pPr>
+        <w:spacing w:after="0"/>
+        <w:ind w:firstLine="709"/>
+        <w:jc w:val="both"/>
+      </w:pPr>
+      <w:r>
+        <w:rPr>
+          <w:lang w:val="be-BY"/>
+        </w:rPr>
+        <w:t>Бат</w:t>
+      </w:r>
+      <w:r>
+        <w:t>ники</w:t>
+      </w:r>
+    </w:p>
+    <w:p>
+      <w:pPr>
+        <w:spacing w:after="0"/>
+        <w:ind w:firstLine="709"/>
+        <w:jc w:val="both"/>
+      </w:pPr>
+    </w:p>
+    <w:p>
+      <w:pPr>
+        <w:spacing w:after="0"/>
+        <w:ind w:firstLine="709"/>
+        <w:jc w:val="both"/>
+      </w:pPr>
+    </w:p>
+    <w:p>
+      <w:pPr>
+        <w:spacing w:after="0"/>
+        <w:ind w:firstLine="709"/>
+        <w:jc w:val="both"/>
+      </w:pPr>
+      <w:r>
+        <w:rPr>
+          <w:lang w:val="en-US"/>
+        </w:rPr>
+        <w:drawing>
+          <wp:inline distT="0" distB="0" distL="0" distR="0" wp14:anchorId="03AD30F5" wp14:editId="263BD71C">
+            <wp:extent cx="4324954" cy="4143953"/>
+            <wp:effectExtent l="0" t="0" r="0" b="0"/>
+            <wp:docPr id="731489375" name="Рисунок 1"/>
+            <wp:cNvGraphicFramePr>
+              <a:graphicFrameLocks xmlns:a="http://schemas.openxmlformats.org/drawingml/2006/main" noChangeAspect="1"/>
+            </wp:cNvGraphicFramePr>
+            <a:graphic xmlns:a="http://schemas.openxmlformats.org/drawingml/2006/main">
+              <a:graphicData uri="http://schemas.openxmlformats.org/drawingml/2006/picture">
+                <pic:pic xmlns:pic="http://schemas.openxmlformats.org/drawingml/2006/picture">
+                  <pic:nvPicPr>
+                    <pic:cNvPr id="731489375" name=""/>
+                    <pic:cNvPicPr/>
+                  </pic:nvPicPr>
+                  <pic:blipFill>
+                    <a:blip r:embed="rId28"/>
+                    <a:stretch>
+                      <a:fillRect/>
+                    </a:stretch>
+                  </pic:blipFill>
+                  <pic:spPr>
+                    <a:xfrm>
+                      <a:off x="0" y="0"/>
+                      <a:ext cx="4324954" cy="4143953"/>
+                    </a:xfrm>
+                    <a:prstGeom prst="rect">
+                      <a:avLst/>
+                    </a:prstGeom>
+                  </pic:spPr>
+                </pic:pic>
+              </a:graphicData>
+            </a:graphic>
+          </wp:inline>
+        </w:drawing>
+      </w:r>
+    </w:p>
+    <w:p>
+      <w:pPr>
+        <w:spacing w:after="0"/>
+        <w:ind w:firstLine="709"/>
+        <w:jc w:val="both"/>
+      </w:pPr>
+    </w:p>
+    <w:p>
+      <w:pPr>
+        <w:spacing w:after="0"/>
+        <w:ind w:firstLine="709"/>
+        <w:jc w:val="both"/>
       </w:pPr>
     </w:p>
     <w:sectPr>
@@ -3978,6 +4152,7 @@
   <w:style w:type="character" w:default="1" w:styleId="a0">
     <w:name w:val="Default Paragraph Font"/>
     <w:uiPriority w:val="1"/>
+    <w:semiHidden/>
     <w:unhideWhenUsed/>
   </w:style>
   <w:style w:type="table" w:default="1" w:styleId="a1">

</xml_diff>

<commit_message>
idk what's here but sp 2 DOESNT WORK
</commit_message>
<xml_diff>
--- a/ос/лабы/2/лб2 скрины.docx
+++ b/ос/лабы/2/лб2 скрины.docx
@@ -77,8 +77,16 @@
         <w:rPr>
           <w:lang w:val="en-US"/>
         </w:rPr>
-        <w:t>4 copy</w:t>
-      </w:r>
+        <w:t xml:space="preserve">4 </w:t>
+      </w:r>
+      <w:proofErr w:type="gramStart"/>
+      <w:r>
+        <w:rPr>
+          <w:lang w:val="en-US"/>
+        </w:rPr>
+        <w:t>copy</w:t>
+      </w:r>
+      <w:proofErr w:type="gramEnd"/>
     </w:p>
     <w:p>
       <w:pPr>
@@ -635,12 +643,14 @@
         <w:ind w:firstLine="709"/>
         <w:jc w:val="both"/>
       </w:pPr>
+      <w:proofErr w:type="spellStart"/>
       <w:r>
         <w:rPr>
           <w:lang w:val="en-US"/>
         </w:rPr>
         <w:t>Xcopy</w:t>
       </w:r>
+      <w:proofErr w:type="spellEnd"/>
       <w:r>
         <w:t xml:space="preserve"> 1</w:t>
       </w:r>
@@ -758,7 +768,15 @@
       </w:r>
       <w:r>
         <w:br/>
-        <w:t>Если в task_01b есть папка images, а в ней ничего нет — с /E она тоже будет скопирована.</w:t>
+        <w:t xml:space="preserve">Если в task_01b есть папка </w:t>
+      </w:r>
+      <w:proofErr w:type="spellStart"/>
+      <w:r>
+        <w:t>images</w:t>
+      </w:r>
+      <w:proofErr w:type="spellEnd"/>
+      <w:r>
+        <w:t>, а в ней ничего нет — с /E она тоже будет скопирована.</w:t>
       </w:r>
     </w:p>
     <w:p>
@@ -814,7 +832,15 @@
       </w:r>
       <w:r>
         <w:br/>
-        <w:t>По умолчанию xcopy их игнорирует.</w:t>
+        <w:t xml:space="preserve">По умолчанию </w:t>
+      </w:r>
+      <w:proofErr w:type="spellStart"/>
+      <w:r>
+        <w:t>xcopy</w:t>
+      </w:r>
+      <w:proofErr w:type="spellEnd"/>
+      <w:r>
+        <w:t xml:space="preserve"> их игнорирует.</w:t>
       </w:r>
     </w:p>
     <w:p>
@@ -847,7 +873,20 @@
       </w:r>
       <w:r>
         <w:br/>
-        <w:t>Файлы вроде desktop.ini или .hiddenfile тоже попадут в копию.</w:t>
+        <w:t xml:space="preserve">Файлы вроде desktop.ini </w:t>
+      </w:r>
+      <w:proofErr w:type="gramStart"/>
+      <w:r>
+        <w:t>или .</w:t>
+      </w:r>
+      <w:proofErr w:type="spellStart"/>
+      <w:r>
+        <w:t>hiddenfile</w:t>
+      </w:r>
+      <w:proofErr w:type="spellEnd"/>
+      <w:proofErr w:type="gramEnd"/>
+      <w:r>
+        <w:t xml:space="preserve"> тоже попадут в копию.</w:t>
       </w:r>
     </w:p>
     <w:p>
@@ -907,7 +946,15 @@
       </w:r>
       <w:r>
         <w:br/>
-        <w:t>Без этого флага xcopy сбрасывает атрибут «только для чтения» в копии.</w:t>
+        <w:t xml:space="preserve">Без этого флага </w:t>
+      </w:r>
+      <w:proofErr w:type="spellStart"/>
+      <w:r>
+        <w:t>xcopy</w:t>
+      </w:r>
+      <w:proofErr w:type="spellEnd"/>
+      <w:r>
+        <w:t xml:space="preserve"> сбрасывает атрибут «только для чтения» в копии.</w:t>
       </w:r>
     </w:p>
     <w:p>
@@ -927,7 +974,15 @@
       </w:r>
       <w:r>
         <w:br/>
-        <w:t>Если исходный файл был Read-only, то в копии он останется таким.</w:t>
+        <w:t xml:space="preserve">Если исходный файл был </w:t>
+      </w:r>
+      <w:proofErr w:type="spellStart"/>
+      <w:r>
+        <w:t>Read-only</w:t>
+      </w:r>
+      <w:proofErr w:type="spellEnd"/>
+      <w:r>
+        <w:t>, то в копии он останется таким.</w:t>
       </w:r>
     </w:p>
     <w:p>
@@ -1007,11 +1062,19 @@
           <w:lang w:val="en-US"/>
         </w:rPr>
       </w:pPr>
-      <w:r>
-        <w:rPr>
-          <w:lang w:val="en-US"/>
-        </w:rPr>
-        <w:t>Xcopy 2</w:t>
+      <w:proofErr w:type="spellStart"/>
+      <w:r>
+        <w:rPr>
+          <w:lang w:val="en-US"/>
+        </w:rPr>
+        <w:t>Xcopy</w:t>
+      </w:r>
+      <w:proofErr w:type="spellEnd"/>
+      <w:r>
+        <w:rPr>
+          <w:lang w:val="en-US"/>
+        </w:rPr>
+        <w:t xml:space="preserve"> 2</w:t>
       </w:r>
     </w:p>
     <w:p>
@@ -1047,8 +1110,33 @@
           <w:b/>
           <w:bCs/>
         </w:rPr>
-        <w:t xml:space="preserve"> /A — Archive only</w:t>
-      </w:r>
+        <w:t xml:space="preserve"> /A — </w:t>
+      </w:r>
+      <w:proofErr w:type="spellStart"/>
+      <w:r>
+        <w:rPr>
+          <w:b/>
+          <w:bCs/>
+        </w:rPr>
+        <w:t>Archive</w:t>
+      </w:r>
+      <w:proofErr w:type="spellEnd"/>
+      <w:r>
+        <w:rPr>
+          <w:b/>
+          <w:bCs/>
+        </w:rPr>
+        <w:t xml:space="preserve"> </w:t>
+      </w:r>
+      <w:proofErr w:type="spellStart"/>
+      <w:r>
+        <w:rPr>
+          <w:b/>
+          <w:bCs/>
+        </w:rPr>
+        <w:t>only</w:t>
+      </w:r>
+      <w:proofErr w:type="spellEnd"/>
     </w:p>
     <w:p>
       <w:pPr>
@@ -1220,8 +1308,33 @@
           <w:b/>
           <w:bCs/>
         </w:rPr>
-        <w:t xml:space="preserve"> /R — Read-only overwrite</w:t>
-      </w:r>
+        <w:t xml:space="preserve"> /R — </w:t>
+      </w:r>
+      <w:proofErr w:type="spellStart"/>
+      <w:r>
+        <w:rPr>
+          <w:b/>
+          <w:bCs/>
+        </w:rPr>
+        <w:t>Read-only</w:t>
+      </w:r>
+      <w:proofErr w:type="spellEnd"/>
+      <w:r>
+        <w:rPr>
+          <w:b/>
+          <w:bCs/>
+        </w:rPr>
+        <w:t xml:space="preserve"> </w:t>
+      </w:r>
+      <w:proofErr w:type="spellStart"/>
+      <w:r>
+        <w:rPr>
+          <w:b/>
+          <w:bCs/>
+        </w:rPr>
+        <w:t>overwrite</w:t>
+      </w:r>
+      <w:proofErr w:type="spellEnd"/>
     </w:p>
     <w:p>
       <w:pPr>
@@ -1294,7 +1407,21 @@
         <w:rPr>
           <w:lang w:val="en-US"/>
         </w:rPr>
-        <w:t xml:space="preserve"> Without this flag, xcopy would </w:t>
+        <w:t xml:space="preserve"> Without this flag, </w:t>
+      </w:r>
+      <w:proofErr w:type="spellStart"/>
+      <w:r>
+        <w:rPr>
+          <w:lang w:val="en-US"/>
+        </w:rPr>
+        <w:t>xcopy</w:t>
+      </w:r>
+      <w:proofErr w:type="spellEnd"/>
+      <w:r>
+        <w:rPr>
+          <w:lang w:val="en-US"/>
+        </w:rPr>
+        <w:t xml:space="preserve"> would </w:t>
       </w:r>
       <w:r>
         <w:rPr>
@@ -1346,8 +1473,33 @@
           <w:b/>
           <w:bCs/>
         </w:rPr>
-        <w:t xml:space="preserve"> /K — Keep attributes</w:t>
-      </w:r>
+        <w:t xml:space="preserve"> /K — </w:t>
+      </w:r>
+      <w:proofErr w:type="spellStart"/>
+      <w:r>
+        <w:rPr>
+          <w:b/>
+          <w:bCs/>
+        </w:rPr>
+        <w:t>Keep</w:t>
+      </w:r>
+      <w:proofErr w:type="spellEnd"/>
+      <w:r>
+        <w:rPr>
+          <w:b/>
+          <w:bCs/>
+        </w:rPr>
+        <w:t xml:space="preserve"> </w:t>
+      </w:r>
+      <w:proofErr w:type="spellStart"/>
+      <w:r>
+        <w:rPr>
+          <w:b/>
+          <w:bCs/>
+        </w:rPr>
+        <w:t>attributes</w:t>
+      </w:r>
+      <w:proofErr w:type="spellEnd"/>
     </w:p>
     <w:p>
       <w:pPr>
@@ -1440,7 +1592,21 @@
         <w:rPr>
           <w:lang w:val="en-US"/>
         </w:rPr>
-        <w:t>By default, xcopy clears the “Read-only” attribute on copied files — /K prevents that.</w:t>
+        <w:t xml:space="preserve">By default, </w:t>
+      </w:r>
+      <w:proofErr w:type="spellStart"/>
+      <w:r>
+        <w:rPr>
+          <w:lang w:val="en-US"/>
+        </w:rPr>
+        <w:t>xcopy</w:t>
+      </w:r>
+      <w:proofErr w:type="spellEnd"/>
+      <w:r>
+        <w:rPr>
+          <w:lang w:val="en-US"/>
+        </w:rPr>
+        <w:t xml:space="preserve"> clears the “Read-only” attribute on copied files — /K prevents that.</w:t>
       </w:r>
     </w:p>
     <w:p>
@@ -2617,17 +2783,28 @@
         <w:ind w:firstLine="709"/>
         <w:jc w:val="both"/>
       </w:pPr>
-      <w:r>
-        <w:t xml:space="preserve">Павершелл </w:t>
-      </w:r>
-    </w:p>
-    <w:p>
-      <w:pPr>
-        <w:spacing w:after="0"/>
-        <w:ind w:firstLine="709"/>
-        <w:jc w:val="both"/>
-      </w:pPr>
-      <w:r>
+      <w:proofErr w:type="spellStart"/>
+      <w:r>
+        <w:t>Павершелл</w:t>
+      </w:r>
+      <w:proofErr w:type="spellEnd"/>
+      <w:r>
+        <w:t xml:space="preserve"> </w:t>
+      </w:r>
+    </w:p>
+    <w:p>
+      <w:pPr>
+        <w:spacing w:after="0"/>
+        <w:ind w:firstLine="709"/>
+        <w:jc w:val="both"/>
+        <w:rPr>
+          <w:lang w:val="be-BY"/>
+        </w:rPr>
+      </w:pPr>
+      <w:r>
+        <w:rPr>
+          <w:noProof/>
+        </w:rPr>
         <w:lastRenderedPageBreak/>
         <w:drawing>
           <wp:inline distT="0" distB="0" distL="0" distR="0" wp14:anchorId="5AF1DB57" wp14:editId="05D553F8">
@@ -2665,6 +2842,150 @@
           </wp:inline>
         </w:drawing>
       </w:r>
+    </w:p>
+    <w:p>
+      <w:pPr>
+        <w:spacing w:after="0"/>
+        <w:ind w:firstLine="709"/>
+        <w:jc w:val="both"/>
+        <w:rPr>
+          <w:lang w:val="be-BY"/>
+        </w:rPr>
+      </w:pPr>
+    </w:p>
+    <w:p>
+      <w:pPr>
+        <w:spacing w:after="0"/>
+        <w:ind w:firstLine="709"/>
+        <w:jc w:val="both"/>
+        <w:rPr>
+          <w:lang w:val="en-US"/>
+        </w:rPr>
+      </w:pPr>
+      <w:r>
+        <w:rPr>
+          <w:lang w:val="en-US"/>
+        </w:rPr>
+        <w:t xml:space="preserve">Bash </w:t>
+      </w:r>
+      <w:proofErr w:type="spellStart"/>
+      <w:r>
+        <w:rPr>
+          <w:lang w:val="en-US"/>
+        </w:rPr>
+        <w:t>printosuser</w:t>
+      </w:r>
+      <w:proofErr w:type="spellEnd"/>
+    </w:p>
+    <w:p>
+      <w:pPr>
+        <w:spacing w:after="0"/>
+        <w:ind w:firstLine="709"/>
+        <w:jc w:val="both"/>
+        <w:rPr>
+          <w:lang w:val="en-US"/>
+        </w:rPr>
+      </w:pPr>
+      <w:r>
+        <w:rPr>
+          <w:lang w:val="en-US"/>
+        </w:rPr>
+        <w:drawing>
+          <wp:inline distT="0" distB="0" distL="0" distR="0" wp14:anchorId="15174632" wp14:editId="24B3872A">
+            <wp:extent cx="5939790" cy="3345815"/>
+            <wp:effectExtent l="0" t="0" r="3810" b="6985"/>
+            <wp:docPr id="1972851597" name="Рисунок 1"/>
+            <wp:cNvGraphicFramePr>
+              <a:graphicFrameLocks xmlns:a="http://schemas.openxmlformats.org/drawingml/2006/main" noChangeAspect="1"/>
+            </wp:cNvGraphicFramePr>
+            <a:graphic xmlns:a="http://schemas.openxmlformats.org/drawingml/2006/main">
+              <a:graphicData uri="http://schemas.openxmlformats.org/drawingml/2006/picture">
+                <pic:pic xmlns:pic="http://schemas.openxmlformats.org/drawingml/2006/picture">
+                  <pic:nvPicPr>
+                    <pic:cNvPr id="1972851597" name=""/>
+                    <pic:cNvPicPr/>
+                  </pic:nvPicPr>
+                  <pic:blipFill>
+                    <a:blip r:embed="rId30"/>
+                    <a:stretch>
+                      <a:fillRect/>
+                    </a:stretch>
+                  </pic:blipFill>
+                  <pic:spPr>
+                    <a:xfrm>
+                      <a:off x="0" y="0"/>
+                      <a:ext cx="5939790" cy="3345815"/>
+                    </a:xfrm>
+                    <a:prstGeom prst="rect">
+                      <a:avLst/>
+                    </a:prstGeom>
+                  </pic:spPr>
+                </pic:pic>
+              </a:graphicData>
+            </a:graphic>
+          </wp:inline>
+        </w:drawing>
+      </w:r>
+    </w:p>
+    <w:p>
+      <w:pPr>
+        <w:spacing w:after="0"/>
+        <w:ind w:firstLine="709"/>
+        <w:jc w:val="both"/>
+        <w:rPr>
+          <w:lang w:val="en-US"/>
+        </w:rPr>
+      </w:pPr>
+      <w:r>
+        <w:rPr>
+          <w:lang w:val="en-US"/>
+        </w:rPr>
+        <w:drawing>
+          <wp:inline distT="0" distB="0" distL="0" distR="0" wp14:anchorId="731A4F70" wp14:editId="33B394BA">
+            <wp:extent cx="5939790" cy="2099945"/>
+            <wp:effectExtent l="0" t="0" r="3810" b="0"/>
+            <wp:docPr id="1977596647" name="Рисунок 1"/>
+            <wp:cNvGraphicFramePr>
+              <a:graphicFrameLocks xmlns:a="http://schemas.openxmlformats.org/drawingml/2006/main" noChangeAspect="1"/>
+            </wp:cNvGraphicFramePr>
+            <a:graphic xmlns:a="http://schemas.openxmlformats.org/drawingml/2006/main">
+              <a:graphicData uri="http://schemas.openxmlformats.org/drawingml/2006/picture">
+                <pic:pic xmlns:pic="http://schemas.openxmlformats.org/drawingml/2006/picture">
+                  <pic:nvPicPr>
+                    <pic:cNvPr id="1977596647" name=""/>
+                    <pic:cNvPicPr/>
+                  </pic:nvPicPr>
+                  <pic:blipFill>
+                    <a:blip r:embed="rId31"/>
+                    <a:stretch>
+                      <a:fillRect/>
+                    </a:stretch>
+                  </pic:blipFill>
+                  <pic:spPr>
+                    <a:xfrm>
+                      <a:off x="0" y="0"/>
+                      <a:ext cx="5939790" cy="2099945"/>
+                    </a:xfrm>
+                    <a:prstGeom prst="rect">
+                      <a:avLst/>
+                    </a:prstGeom>
+                  </pic:spPr>
+                </pic:pic>
+              </a:graphicData>
+            </a:graphic>
+          </wp:inline>
+        </w:drawing>
+      </w:r>
+    </w:p>
+    <w:p>
+      <w:pPr>
+        <w:spacing w:after="0"/>
+        <w:ind w:firstLine="709"/>
+        <w:jc w:val="both"/>
+        <w:rPr>
+          <w:lang w:val="en-US"/>
+        </w:rPr>
+      </w:pPr>
     </w:p>
     <w:sectPr>
       <w:pgSz w:w="11906" w:h="16838" w:code="9"/>

</xml_diff>